<commit_message>
work in progress, adjustments to make permit package document figures managed separately from document types
</commit_message>
<xml_diff>
--- a/services/core-api/app/templates/permit/Permit.docx
+++ b/services/core-api/app/templates/permit/Permit.docx
@@ -1800,6 +1800,172 @@
           <w:u w:val="single"/>
         </w:rPr>
         <w:t xml:space="preserve"> and Reclamation Program</w:t>
+      </w:r>
+    </w:p>
+    <w:p>
+      <w:pPr>
+        <w:numPr>
+          <w:ilvl w:val="0"/>
+          <w:numId w:val="9001"/>
+        </w:numPr>
+        <w:pBdr>
+          <w:top w:val="nil"/>
+          <w:left w:val="nil"/>
+          <w:bottom w:val="nil"/>
+          <w:right w:val="nil"/>
+          <w:between w:val="nil"/>
+        </w:pBdr>
+        <w:spacing w:after="0" w:line="300" w:lineRule="auto"/>
+        <w:rPr>
+          <w:rFonts w:ascii="Arial" w:eastAsia="Times New Roman" w:hAnsi="Arial" w:cs="Arial"/>
+          <w:color w:val="000000"/>
+        </w:rPr>
+      </w:pPr>
+      <w:r>
+        <w:rPr>
+          <w:rFonts w:ascii="Arial" w:eastAsia="Times New Roman" w:hAnsi="Arial" w:cs="Arial"/>
+          <w:color w:val="000000"/>
+        </w:rPr>
+        <w:t>{</w:t>
+      </w:r>
+      <w:proofErr w:type="spellStart"/>
+      <w:proofErr w:type="gramStart"/>
+      <w:r>
+        <w:rPr>
+          <w:rFonts w:ascii="Arial" w:eastAsia="Times New Roman" w:hAnsi="Arial" w:cs="Arial"/>
+          <w:color w:val="000000"/>
+        </w:rPr>
+        <w:t>d.</w:t>
+      </w:r>
+      <w:r>
+        <w:rPr>
+          <w:rFonts w:ascii="Arial" w:eastAsia="Times New Roman" w:hAnsi="Arial" w:cs="Arial"/>
+          <w:color w:val="000000"/>
+        </w:rPr>
+        <w:t>final</w:t>
+      </w:r>
+      <w:proofErr w:type="gramEnd"/>
+      <w:r>
+        <w:rPr>
+          <w:rFonts w:ascii="Arial" w:eastAsia="Times New Roman" w:hAnsi="Arial" w:cs="Arial"/>
+          <w:color w:val="000000"/>
+        </w:rPr>
+        <w:t>_application_package_figures</w:t>
+      </w:r>
+      <w:proofErr w:type="spellEnd"/>
+      <w:r>
+        <w:rPr>
+          <w:rFonts w:ascii="Arial" w:eastAsia="Times New Roman" w:hAnsi="Arial" w:cs="Arial"/>
+          <w:color w:val="000000"/>
+        </w:rPr>
+        <w:t>[</w:t>
+      </w:r>
+      <w:proofErr w:type="spellStart"/>
+      <w:r>
+        <w:rPr>
+          <w:rFonts w:ascii="Arial" w:eastAsia="Times New Roman" w:hAnsi="Arial" w:cs="Arial"/>
+          <w:color w:val="000000"/>
+        </w:rPr>
+        <w:t>i</w:t>
+      </w:r>
+      <w:proofErr w:type="spellEnd"/>
+      <w:r>
+        <w:rPr>
+          <w:rFonts w:ascii="Arial" w:eastAsia="Times New Roman" w:hAnsi="Arial" w:cs="Arial"/>
+          <w:color w:val="000000"/>
+        </w:rPr>
+        <w:t>].</w:t>
+      </w:r>
+      <w:proofErr w:type="spellStart"/>
+      <w:r>
+        <w:rPr>
+          <w:rFonts w:ascii="Arial" w:eastAsia="Times New Roman" w:hAnsi="Arial" w:cs="Arial"/>
+          <w:color w:val="000000"/>
+        </w:rPr>
+        <w:t>document_info</w:t>
+      </w:r>
+      <w:proofErr w:type="spellEnd"/>
+      <w:r>
+        <w:rPr>
+          <w:rFonts w:ascii="Arial" w:eastAsia="Times New Roman" w:hAnsi="Arial" w:cs="Arial"/>
+          <w:color w:val="000000"/>
+        </w:rPr>
+        <w:t>}</w:t>
+      </w:r>
+    </w:p>
+    <w:p>
+      <w:pPr>
+        <w:numPr>
+          <w:ilvl w:val="0"/>
+          <w:numId w:val="9001"/>
+        </w:numPr>
+        <w:pBdr>
+          <w:top w:val="nil"/>
+          <w:left w:val="nil"/>
+          <w:bottom w:val="nil"/>
+          <w:right w:val="nil"/>
+          <w:between w:val="nil"/>
+        </w:pBdr>
+        <w:spacing w:after="120" w:line="300" w:lineRule="auto"/>
+        <w:rPr>
+          <w:rFonts w:ascii="Arial" w:hAnsi="Arial" w:cs="Arial"/>
+          <w:color w:val="000000"/>
+        </w:rPr>
+      </w:pPr>
+      <w:r>
+        <w:rPr>
+          <w:rFonts w:ascii="Arial" w:eastAsia="Times New Roman" w:hAnsi="Arial" w:cs="Arial"/>
+          <w:color w:val="000000"/>
+        </w:rPr>
+        <w:t>{</w:t>
+      </w:r>
+      <w:proofErr w:type="spellStart"/>
+      <w:proofErr w:type="gramStart"/>
+      <w:r>
+        <w:rPr>
+          <w:rFonts w:ascii="Arial" w:eastAsia="Times New Roman" w:hAnsi="Arial" w:cs="Arial"/>
+          <w:color w:val="000000"/>
+        </w:rPr>
+        <w:t>d.</w:t>
+      </w:r>
+      <w:r>
+        <w:rPr>
+          <w:rFonts w:ascii="Arial" w:eastAsia="Times New Roman" w:hAnsi="Arial" w:cs="Arial"/>
+          <w:color w:val="000000"/>
+        </w:rPr>
+        <w:t>final</w:t>
+      </w:r>
+      <w:proofErr w:type="gramEnd"/>
+      <w:r>
+        <w:rPr>
+          <w:rFonts w:ascii="Arial" w:eastAsia="Times New Roman" w:hAnsi="Arial" w:cs="Arial"/>
+          <w:color w:val="000000"/>
+        </w:rPr>
+        <w:t>_application_package_figures</w:t>
+      </w:r>
+      <w:proofErr w:type="spellEnd"/>
+      <w:r>
+        <w:rPr>
+          <w:rFonts w:ascii="Arial" w:eastAsia="Times New Roman" w:hAnsi="Arial" w:cs="Arial"/>
+          <w:color w:val="000000"/>
+        </w:rPr>
+        <w:t>[i+1].</w:t>
+      </w:r>
+      <w:proofErr w:type="spellStart"/>
+      <w:r>
+        <w:rPr>
+          <w:rFonts w:ascii="Arial" w:eastAsia="Times New Roman" w:hAnsi="Arial" w:cs="Arial"/>
+          <w:color w:val="000000"/>
+        </w:rPr>
+        <w:t>document_info</w:t>
+      </w:r>
+      <w:proofErr w:type="spellEnd"/>
+      <w:r>
+        <w:rPr>
+          <w:rFonts w:ascii="Arial" w:eastAsia="Times New Roman" w:hAnsi="Arial" w:cs="Arial"/>
+          <w:color w:val="000000"/>
+        </w:rPr>
+        <w:t>}</w:t>
       </w:r>
     </w:p>
     <w:p>
@@ -12962,6 +13128,25 @@
       </w:pPr>
     </w:lvl>
   </w:abstractNum>
+  <w:abstractNum w:abstractNumId="9000">
+    <w:multiLevelType w:val="hybridMultilevel"/>
+    <w:lvl w:ilvl="0">
+      <w:start w:val="1"/>
+      <w:numFmt w:val="decimal"/>
+      <w:lvlText w:val="%1."/>
+      <w:lvlJc w:val="left"/>
+      <w:pPr>
+        <w:ind w:left="1425" w:hanging="705"/>
+      </w:pPr>
+      <w:rPr>
+        <w:rFonts w:ascii="Times New Roman" w:eastAsia="Times New Roman" w:hAnsi="Times New Roman" w:cs="Times New Roman" w:hint="default"/>
+        <w:b/>
+        <w:bCs w:val="0"/>
+        <w:sz w:val="22"/>
+        <w:szCs w:val="22"/>
+      </w:rPr>
+    </w:lvl>
+  </w:abstractNum>
   <w:num w:numId="1" w16cid:durableId="1468428760">
     <w:abstractNumId w:val="1"/>
   </w:num>
@@ -13356,6 +13541,9 @@
     <w:abstractNumId w:val="23"/>
   </w:num>
   <w:numIdMacAtCleanup w:val="69"/>
+  <w:num w:numId="9001">
+    <w:abstractNumId w:val="9000"/>
+  </w:num>
 </w:numbering>
 </file>
 

</xml_diff>

<commit_message>
[MDS-6986] Manage figures separately from documents in notice of work (#4004)
* work in progress, adjustments to make permit package document figures managed separately from document types

* adding tests

* adding back removed comment

* adjustment to show whole numbers ordering for figure types in cdv menu

* fixing test errors

* fix for submission doc bug and test
</commit_message>
<xml_diff>
--- a/services/core-api/app/templates/permit/Permit.docx
+++ b/services/core-api/app/templates/permit/Permit.docx
@@ -1800,6 +1800,172 @@
           <w:u w:val="single"/>
         </w:rPr>
         <w:t xml:space="preserve"> and Reclamation Program</w:t>
+      </w:r>
+    </w:p>
+    <w:p>
+      <w:pPr>
+        <w:numPr>
+          <w:ilvl w:val="0"/>
+          <w:numId w:val="9001"/>
+        </w:numPr>
+        <w:pBdr>
+          <w:top w:val="nil"/>
+          <w:left w:val="nil"/>
+          <w:bottom w:val="nil"/>
+          <w:right w:val="nil"/>
+          <w:between w:val="nil"/>
+        </w:pBdr>
+        <w:spacing w:after="0" w:line="300" w:lineRule="auto"/>
+        <w:rPr>
+          <w:rFonts w:ascii="Arial" w:eastAsia="Times New Roman" w:hAnsi="Arial" w:cs="Arial"/>
+          <w:color w:val="000000"/>
+        </w:rPr>
+      </w:pPr>
+      <w:r>
+        <w:rPr>
+          <w:rFonts w:ascii="Arial" w:eastAsia="Times New Roman" w:hAnsi="Arial" w:cs="Arial"/>
+          <w:color w:val="000000"/>
+        </w:rPr>
+        <w:t>{</w:t>
+      </w:r>
+      <w:proofErr w:type="spellStart"/>
+      <w:proofErr w:type="gramStart"/>
+      <w:r>
+        <w:rPr>
+          <w:rFonts w:ascii="Arial" w:eastAsia="Times New Roman" w:hAnsi="Arial" w:cs="Arial"/>
+          <w:color w:val="000000"/>
+        </w:rPr>
+        <w:t>d.</w:t>
+      </w:r>
+      <w:r>
+        <w:rPr>
+          <w:rFonts w:ascii="Arial" w:eastAsia="Times New Roman" w:hAnsi="Arial" w:cs="Arial"/>
+          <w:color w:val="000000"/>
+        </w:rPr>
+        <w:t>final</w:t>
+      </w:r>
+      <w:proofErr w:type="gramEnd"/>
+      <w:r>
+        <w:rPr>
+          <w:rFonts w:ascii="Arial" w:eastAsia="Times New Roman" w:hAnsi="Arial" w:cs="Arial"/>
+          <w:color w:val="000000"/>
+        </w:rPr>
+        <w:t>_application_package_figures</w:t>
+      </w:r>
+      <w:proofErr w:type="spellEnd"/>
+      <w:r>
+        <w:rPr>
+          <w:rFonts w:ascii="Arial" w:eastAsia="Times New Roman" w:hAnsi="Arial" w:cs="Arial"/>
+          <w:color w:val="000000"/>
+        </w:rPr>
+        <w:t>[</w:t>
+      </w:r>
+      <w:proofErr w:type="spellStart"/>
+      <w:r>
+        <w:rPr>
+          <w:rFonts w:ascii="Arial" w:eastAsia="Times New Roman" w:hAnsi="Arial" w:cs="Arial"/>
+          <w:color w:val="000000"/>
+        </w:rPr>
+        <w:t>i</w:t>
+      </w:r>
+      <w:proofErr w:type="spellEnd"/>
+      <w:r>
+        <w:rPr>
+          <w:rFonts w:ascii="Arial" w:eastAsia="Times New Roman" w:hAnsi="Arial" w:cs="Arial"/>
+          <w:color w:val="000000"/>
+        </w:rPr>
+        <w:t>].</w:t>
+      </w:r>
+      <w:proofErr w:type="spellStart"/>
+      <w:r>
+        <w:rPr>
+          <w:rFonts w:ascii="Arial" w:eastAsia="Times New Roman" w:hAnsi="Arial" w:cs="Arial"/>
+          <w:color w:val="000000"/>
+        </w:rPr>
+        <w:t>document_info</w:t>
+      </w:r>
+      <w:proofErr w:type="spellEnd"/>
+      <w:r>
+        <w:rPr>
+          <w:rFonts w:ascii="Arial" w:eastAsia="Times New Roman" w:hAnsi="Arial" w:cs="Arial"/>
+          <w:color w:val="000000"/>
+        </w:rPr>
+        <w:t>}</w:t>
+      </w:r>
+    </w:p>
+    <w:p>
+      <w:pPr>
+        <w:numPr>
+          <w:ilvl w:val="0"/>
+          <w:numId w:val="9001"/>
+        </w:numPr>
+        <w:pBdr>
+          <w:top w:val="nil"/>
+          <w:left w:val="nil"/>
+          <w:bottom w:val="nil"/>
+          <w:right w:val="nil"/>
+          <w:between w:val="nil"/>
+        </w:pBdr>
+        <w:spacing w:after="120" w:line="300" w:lineRule="auto"/>
+        <w:rPr>
+          <w:rFonts w:ascii="Arial" w:hAnsi="Arial" w:cs="Arial"/>
+          <w:color w:val="000000"/>
+        </w:rPr>
+      </w:pPr>
+      <w:r>
+        <w:rPr>
+          <w:rFonts w:ascii="Arial" w:eastAsia="Times New Roman" w:hAnsi="Arial" w:cs="Arial"/>
+          <w:color w:val="000000"/>
+        </w:rPr>
+        <w:t>{</w:t>
+      </w:r>
+      <w:proofErr w:type="spellStart"/>
+      <w:proofErr w:type="gramStart"/>
+      <w:r>
+        <w:rPr>
+          <w:rFonts w:ascii="Arial" w:eastAsia="Times New Roman" w:hAnsi="Arial" w:cs="Arial"/>
+          <w:color w:val="000000"/>
+        </w:rPr>
+        <w:t>d.</w:t>
+      </w:r>
+      <w:r>
+        <w:rPr>
+          <w:rFonts w:ascii="Arial" w:eastAsia="Times New Roman" w:hAnsi="Arial" w:cs="Arial"/>
+          <w:color w:val="000000"/>
+        </w:rPr>
+        <w:t>final</w:t>
+      </w:r>
+      <w:proofErr w:type="gramEnd"/>
+      <w:r>
+        <w:rPr>
+          <w:rFonts w:ascii="Arial" w:eastAsia="Times New Roman" w:hAnsi="Arial" w:cs="Arial"/>
+          <w:color w:val="000000"/>
+        </w:rPr>
+        <w:t>_application_package_figures</w:t>
+      </w:r>
+      <w:proofErr w:type="spellEnd"/>
+      <w:r>
+        <w:rPr>
+          <w:rFonts w:ascii="Arial" w:eastAsia="Times New Roman" w:hAnsi="Arial" w:cs="Arial"/>
+          <w:color w:val="000000"/>
+        </w:rPr>
+        <w:t>[i+1].</w:t>
+      </w:r>
+      <w:proofErr w:type="spellStart"/>
+      <w:r>
+        <w:rPr>
+          <w:rFonts w:ascii="Arial" w:eastAsia="Times New Roman" w:hAnsi="Arial" w:cs="Arial"/>
+          <w:color w:val="000000"/>
+        </w:rPr>
+        <w:t>document_info</w:t>
+      </w:r>
+      <w:proofErr w:type="spellEnd"/>
+      <w:r>
+        <w:rPr>
+          <w:rFonts w:ascii="Arial" w:eastAsia="Times New Roman" w:hAnsi="Arial" w:cs="Arial"/>
+          <w:color w:val="000000"/>
+        </w:rPr>
+        <w:t>}</w:t>
       </w:r>
     </w:p>
     <w:p>
@@ -12962,6 +13128,25 @@
       </w:pPr>
     </w:lvl>
   </w:abstractNum>
+  <w:abstractNum w:abstractNumId="9000">
+    <w:multiLevelType w:val="hybridMultilevel"/>
+    <w:lvl w:ilvl="0">
+      <w:start w:val="1"/>
+      <w:numFmt w:val="decimal"/>
+      <w:lvlText w:val="%1."/>
+      <w:lvlJc w:val="left"/>
+      <w:pPr>
+        <w:ind w:left="1425" w:hanging="705"/>
+      </w:pPr>
+      <w:rPr>
+        <w:rFonts w:ascii="Times New Roman" w:eastAsia="Times New Roman" w:hAnsi="Times New Roman" w:cs="Times New Roman" w:hint="default"/>
+        <w:b/>
+        <w:bCs w:val="0"/>
+        <w:sz w:val="22"/>
+        <w:szCs w:val="22"/>
+      </w:rPr>
+    </w:lvl>
+  </w:abstractNum>
   <w:num w:numId="1" w16cid:durableId="1468428760">
     <w:abstractNumId w:val="1"/>
   </w:num>
@@ -13356,6 +13541,9 @@
     <w:abstractNumId w:val="23"/>
   </w:num>
   <w:numIdMacAtCleanup w:val="69"/>
+  <w:num w:numId="9001">
+    <w:abstractNumId w:val="9000"/>
+  </w:num>
 </w:numbering>
 </file>
 

</xml_diff>